<commit_message>
Refresh blank template: no italic, TECHNICAL SKILLS header
Source document updated: the degree line is no longer italic, matching the rule
that a resume uses bold, underlined section headers, and regular weight only,
and the skills header is now TECHNICAL SKILLS.

Verified before committing: no docProps, no personal data, name in title case at
20pt, 16pt target title, underlined 11pt headers, 3/7/1 spacing intact, and zero
italic runs in the package.

house-style.md notes that the shipped template carries the technical header, and
to swap it for CORE COMPETENCIES on a non-technical resume.
</commit_message>
<xml_diff>
--- a/plugins/resume-forge/assets/Resume_Template_Clean.docx
+++ b/plugins/resume-forge/assets/Resume_Template_Clean.docx
@@ -229,18 +229,14 @@
       </w:pPr>
       <w:r>
         <w:rPr>
-          <w:rFonts w:ascii="Calibri" w:cs="Calibri" w:eastAsia="Calibri" w:hAnsi="Calibri"/>
-          <w:b w:val="1"/>
-          <w:bCs w:val="1"/>
-          <w:i w:val="0"/>
-          <w:iCs w:val="0"/>
-          <w:color w:val="000000"/>
+          <w:b w:val="1"/>
+          <w:bCs w:val="1"/>
           <w:sz w:val="22"/>
           <w:szCs w:val="22"/>
           <w:u w:val="single"/>
           <w:rtl w:val="0"/>
         </w:rPr>
-        <w:t xml:space="preserve">CORE COMPETENCIES</w:t>
+        <w:t xml:space="preserve">TECHNICAL SKILLS</w:t>
       </w:r>
       <w:r>
         <w:rPr>
@@ -1158,8 +1154,6 @@
           <w:rFonts w:ascii="Calibri" w:cs="Calibri" w:eastAsia="Calibri" w:hAnsi="Calibri"/>
           <w:b w:val="0"/>
           <w:bCs w:val="0"/>
-          <w:i w:val="1"/>
-          <w:iCs w:val="1"/>
           <w:color w:val="000000"/>
           <w:sz w:val="22"/>
           <w:szCs w:val="22"/>

</xml_diff>